<commit_message>
Link the live app and keep the queue table readable at narrow widths
- README, solution document and deck now point to the deployed app
- Queue table uses fixed column widths so Band and Status are not clipped
- Reasons chart leaves room for the value label on its longest bar

Co-Authored-By: Claude Opus 5.5 <noreply@anthropic.com>
</commit_message>
<xml_diff>
--- a/docs/FraudLens_Solution_Document.docx
+++ b/docs/FraudLens_Solution_Document.docx
@@ -71,13 +71,34 @@
         </w:rPr>
         <w:t xml:space="preserve">Repository: </w:t>
       </w:r>
-      <w:hyperlink w:history="1" r:id="rIds9dokzdzpqgrqf7pmbayt">
+      <w:hyperlink w:history="1" r:id="rId-yxyy19slfgwzid8-4q3b">
         <w:r>
           <w:rPr>
             <w:rStyle w:val="Hyperlink"/>
             <w:rFonts w:ascii="Calibri" w:cs="Calibri" w:eastAsia="Calibri" w:hAnsi="Calibri"/>
           </w:rPr>
           <w:t xml:space="preserve">github.com/mjbharathgithub/Fraud-Lens</w:t>
+        </w:r>
+      </w:hyperlink>
+    </w:p>
+    <w:p>
+      <w:pPr>
+        <w:spacing w:after="140"/>
+      </w:pPr>
+      <w:r>
+        <w:rPr>
+          <w:rFonts w:ascii="Calibri" w:cs="Calibri" w:eastAsia="Calibri" w:hAnsi="Calibri"/>
+          <w:color w:val="5F5E5A"/>
+        </w:rPr>
+        <w:t xml:space="preserve">Live app: </w:t>
+      </w:r>
+      <w:hyperlink w:history="1" r:id="rIdk0jm3iw52oy_chnp8xol-">
+        <w:r>
+          <w:rPr>
+            <w:rStyle w:val="Hyperlink"/>
+            <w:rFonts w:ascii="Calibri" w:cs="Calibri" w:eastAsia="Calibri" w:hAnsi="Calibri"/>
+          </w:rPr>
+          <w:t xml:space="preserve">fraudlens-triage.streamlit.app</w:t>
         </w:r>
       </w:hyperlink>
     </w:p>
@@ -1550,70 +1571,6 @@
             <wp:extent cx="4752975" cy="3505200"/>
             <wp:effectExtent t="0" r="0" b="0" l="0"/>
             <wp:docPr id="1" name="" descr="" title=""/>
-            <wp:cNvGraphicFramePr>
-              <a:graphicFrameLocks xmlns:a="http://schemas.openxmlformats.org/drawingml/2006/main" noChangeAspect="1"/>
-            </wp:cNvGraphicFramePr>
-            <a:graphic xmlns:a="http://schemas.openxmlformats.org/drawingml/2006/main">
-              <a:graphicData uri="http://schemas.openxmlformats.org/drawingml/2006/picture">
-                <pic:pic xmlns:pic="http://schemas.openxmlformats.org/drawingml/2006/picture">
-                  <pic:nvPicPr>
-                    <pic:cNvPr id="0" name="" descr=""/>
-                    <pic:cNvPicPr>
-                      <a:picLocks noChangeAspect="1" noChangeArrowheads="1"/>
-                    </pic:cNvPicPr>
-                  </pic:nvPicPr>
-                  <pic:blipFill>
-                    <a:blip r:embed="rId9" cstate="none"/>
-                    <a:srcRect/>
-                    <a:stretch>
-                      <a:fillRect/>
-                    </a:stretch>
-                  </pic:blipFill>
-                  <pic:spPr bwMode="auto">
-                    <a:xfrm>
-                      <a:off x="0" y="0"/>
-                      <a:ext cx="4752975" cy="3505200"/>
-                    </a:xfrm>
-                    <a:prstGeom prst="rect">
-                      <a:avLst/>
-                    </a:prstGeom>
-                  </pic:spPr>
-                </pic:pic>
-              </a:graphicData>
-            </a:graphic>
-          </wp:inline>
-        </w:drawing>
-      </w:r>
-    </w:p>
-    <w:p>
-      <w:pPr>
-        <w:spacing w:after="200"/>
-        <w:jc w:val="center"/>
-      </w:pPr>
-      <w:r>
-        <w:rPr>
-          <w:rFonts w:ascii="Calibri" w:cs="Calibri" w:eastAsia="Calibri" w:hAnsi="Calibri"/>
-          <w:i/>
-          <w:iCs/>
-          <w:color w:val="5F5E5A"/>
-          <w:sz w:val="18"/>
-          <w:szCs w:val="18"/>
-        </w:rPr>
-        <w:t xml:space="preserve">Figure 1. Fraud concentrates in the quiet overnight hours.</w:t>
-      </w:r>
-    </w:p>
-    <w:p>
-      <w:pPr>
-        <w:keepNext/>
-        <w:spacing w:after="60" w:before="120"/>
-        <w:jc w:val="center"/>
-      </w:pPr>
-      <w:r>
-        <w:drawing>
-          <wp:inline distT="0" distB="0" distL="0" distR="0">
-            <wp:extent cx="4752975" cy="2886075"/>
-            <wp:effectExtent t="0" r="0" b="0" l="0"/>
-            <wp:docPr id="2" name="" descr="" title=""/>
             <wp:cNvGraphicFramePr>
               <a:graphicFrameLocks xmlns:a="http://schemas.openxmlformats.org/drawingml/2006/main" noChangeAspect="1"/>
             </wp:cNvGraphicFramePr>
@@ -1636,7 +1593,7 @@
                   <pic:spPr bwMode="auto">
                     <a:xfrm>
                       <a:off x="0" y="0"/>
-                      <a:ext cx="4752975" cy="2886075"/>
+                      <a:ext cx="4752975" cy="3505200"/>
                     </a:xfrm>
                     <a:prstGeom prst="rect">
                       <a:avLst/>
@@ -1663,174 +1620,7 @@
           <w:sz w:val="18"/>
           <w:szCs w:val="18"/>
         </w:rPr>
-        <w:t xml:space="preserve">Figure 2. Fraud amounts skew small: a third are EUR 1.00 or less.</w:t>
-      </w:r>
-    </w:p>
-    <w:p>
-      <w:pPr>
-        <w:pStyle w:val="Heading1"/>
-        <w:spacing w:after="160" w:before="360"/>
-      </w:pPr>
-      <w:r>
-        <w:rPr>
-          <w:rFonts w:ascii="Calibri" w:cs="Calibri" w:eastAsia="Calibri" w:hAnsi="Calibri"/>
-        </w:rPr>
-        <w:t xml:space="preserve">4. Solution overview</w:t>
-      </w:r>
-    </w:p>
-    <w:p>
-      <w:pPr>
-        <w:spacing w:after="140" w:line="300"/>
-      </w:pPr>
-      <w:r>
-        <w:rPr>
-          <w:rFonts w:ascii="Calibri" w:cs="Calibri" w:eastAsia="Calibri" w:hAnsi="Calibri"/>
-        </w:rPr>
-        <w:t xml:space="preserve">FraudLens turns a day of transactions into a ranked, explained, actionable queue in six steps.</w:t>
-      </w:r>
-    </w:p>
-    <w:p>
-      <w:pPr>
-        <w:pStyle w:val="ListParagraph"/>
-        <w:numPr>
-          <w:ilvl w:val="0"/>
-          <w:numId w:val="3"/>
-        </w:numPr>
-        <w:spacing w:after="80" w:line="290"/>
-      </w:pPr>
-      <w:r>
-        <w:rPr>
-          <w:rFonts w:ascii="Calibri" w:cs="Calibri" w:eastAsia="Calibri" w:hAnsi="Calibri"/>
-          <w:b/>
-          <w:bCs/>
-        </w:rPr>
-        <w:t xml:space="preserve">Score.</w:t>
-      </w:r>
-      <w:r>
-        <w:rPr>
-          <w:rFonts w:ascii="Calibri" w:cs="Calibri" w:eastAsia="Calibri" w:hAnsi="Calibri"/>
-        </w:rPr>
-        <w:t xml:space="preserve"> A gradient-boosted model (XGBoost), trained on day 1 only, gives each transaction a fraud-risk score between 0 and 1.</w:t>
-      </w:r>
-    </w:p>
-    <w:p>
-      <w:pPr>
-        <w:pStyle w:val="ListParagraph"/>
-        <w:numPr>
-          <w:ilvl w:val="0"/>
-          <w:numId w:val="3"/>
-        </w:numPr>
-        <w:spacing w:after="80" w:line="290"/>
-      </w:pPr>
-      <w:r>
-        <w:rPr>
-          <w:rFonts w:ascii="Calibri" w:cs="Calibri" w:eastAsia="Calibri" w:hAnsi="Calibri"/>
-          <w:b/>
-          <w:bCs/>
-        </w:rPr>
-        <w:t xml:space="preserve">Rank to capacity.</w:t>
-      </w:r>
-      <w:r>
-        <w:rPr>
-          <w:rFonts w:ascii="Calibri" w:cs="Calibri" w:eastAsia="Calibri" w:hAnsi="Calibri"/>
-        </w:rPr>
-        <w:t xml:space="preserve"> The 200 highest scores become the day's alert queue. The cutoff is the team's capacity, not an arbitrary probability.</w:t>
-      </w:r>
-    </w:p>
-    <w:p>
-      <w:pPr>
-        <w:pStyle w:val="ListParagraph"/>
-        <w:numPr>
-          <w:ilvl w:val="0"/>
-          <w:numId w:val="3"/>
-        </w:numPr>
-        <w:spacing w:after="80" w:line="290"/>
-      </w:pPr>
-      <w:r>
-        <w:rPr>
-          <w:rFonts w:ascii="Calibri" w:cs="Calibri" w:eastAsia="Calibri" w:hAnsi="Calibri"/>
-          <w:b/>
-          <w:bCs/>
-        </w:rPr>
-        <w:t xml:space="preserve">Explain.</w:t>
-      </w:r>
-      <w:r>
-        <w:rPr>
-          <w:rFonts w:ascii="Calibri" w:cs="Calibri" w:eastAsia="Calibri" w:hAnsi="Calibri"/>
-        </w:rPr>
-        <w:t xml:space="preserve"> Each alert carries its top three reasons, computed as exact SHAP contributions and phrased against genuine behaviour, for example "V14 = -7.46: lower than 99.9% of genuine transactions".</w:t>
-      </w:r>
-    </w:p>
-    <w:p>
-      <w:pPr>
-        <w:pStyle w:val="ListParagraph"/>
-        <w:numPr>
-          <w:ilvl w:val="0"/>
-          <w:numId w:val="3"/>
-        </w:numPr>
-        <w:spacing w:after="80" w:line="290"/>
-      </w:pPr>
-      <w:r>
-        <w:rPr>
-          <w:rFonts w:ascii="Calibri" w:cs="Calibri" w:eastAsia="Calibri" w:hAnsi="Calibri"/>
-          <w:b/>
-          <w:bCs/>
-        </w:rPr>
-        <w:t xml:space="preserve">Recommend.</w:t>
-      </w:r>
-      <w:r>
-        <w:rPr>
-          <w:rFonts w:ascii="Calibri" w:cs="Calibri" w:eastAsia="Calibri" w:hAnsi="Calibri"/>
-        </w:rPr>
-        <w:t xml:space="preserve"> A rule-based policy maps the risk band to an action: hold and call, step-up verification, or analyst review.</w:t>
-      </w:r>
-    </w:p>
-    <w:p>
-      <w:pPr>
-        <w:pStyle w:val="ListParagraph"/>
-        <w:numPr>
-          <w:ilvl w:val="0"/>
-          <w:numId w:val="3"/>
-        </w:numPr>
-        <w:spacing w:after="80" w:line="290"/>
-      </w:pPr>
-      <w:r>
-        <w:rPr>
-          <w:rFonts w:ascii="Calibri" w:cs="Calibri" w:eastAsia="Calibri" w:hAnsi="Calibri"/>
-          <w:b/>
-          <w:bCs/>
-        </w:rPr>
-        <w:t xml:space="preserve">Draft.</w:t>
-      </w:r>
-      <w:r>
-        <w:rPr>
-          <w:rFonts w:ascii="Calibri" w:cs="Calibri" w:eastAsia="Calibri" w:hAnsi="Calibri"/>
-        </w:rPr>
-        <w:t xml:space="preserve"> A review-note agent writes the note for each alert, from a template or with a local open-source LLM whose output is checked against the evidence.</w:t>
-      </w:r>
-    </w:p>
-    <w:p>
-      <w:pPr>
-        <w:pStyle w:val="ListParagraph"/>
-        <w:numPr>
-          <w:ilvl w:val="0"/>
-          <w:numId w:val="3"/>
-        </w:numPr>
-        <w:spacing w:after="80" w:line="290"/>
-      </w:pPr>
-      <w:r>
-        <w:rPr>
-          <w:rFonts w:ascii="Calibri" w:cs="Calibri" w:eastAsia="Calibri" w:hAnsi="Calibri"/>
-          <w:b/>
-          <w:bCs/>
-        </w:rPr>
-        <w:t xml:space="preserve">Wait for a human.</w:t>
-      </w:r>
-      <w:r>
-        <w:rPr>
-          <w:rFonts w:ascii="Calibri" w:cs="Calibri" w:eastAsia="Calibri" w:hAnsi="Calibri"/>
-        </w:rPr>
-        <w:t xml:space="preserve"> Every action is PENDING_APPROVAL. An analyst approves, rejects or escalates, and each decision goes to an audit log.</w:t>
+        <w:t xml:space="preserve">Figure 1. Fraud concentrates in the quiet overnight hours.</w:t>
       </w:r>
     </w:p>
     <w:p>
@@ -1842,9 +1632,9 @@
       <w:r>
         <w:drawing>
           <wp:inline distT="0" distB="0" distL="0" distR="0">
-            <wp:extent cx="4752975" cy="3714750"/>
+            <wp:extent cx="4752975" cy="2886075"/>
             <wp:effectExtent t="0" r="0" b="0" l="0"/>
-            <wp:docPr id="3" name="" descr="" title=""/>
+            <wp:docPr id="2" name="" descr="" title=""/>
             <wp:cNvGraphicFramePr>
               <a:graphicFrameLocks xmlns:a="http://schemas.openxmlformats.org/drawingml/2006/main" noChangeAspect="1"/>
             </wp:cNvGraphicFramePr>
@@ -1867,6 +1657,237 @@
                   <pic:spPr bwMode="auto">
                     <a:xfrm>
                       <a:off x="0" y="0"/>
+                      <a:ext cx="4752975" cy="2886075"/>
+                    </a:xfrm>
+                    <a:prstGeom prst="rect">
+                      <a:avLst/>
+                    </a:prstGeom>
+                  </pic:spPr>
+                </pic:pic>
+              </a:graphicData>
+            </a:graphic>
+          </wp:inline>
+        </w:drawing>
+      </w:r>
+    </w:p>
+    <w:p>
+      <w:pPr>
+        <w:spacing w:after="200"/>
+        <w:jc w:val="center"/>
+      </w:pPr>
+      <w:r>
+        <w:rPr>
+          <w:rFonts w:ascii="Calibri" w:cs="Calibri" w:eastAsia="Calibri" w:hAnsi="Calibri"/>
+          <w:i/>
+          <w:iCs/>
+          <w:color w:val="5F5E5A"/>
+          <w:sz w:val="18"/>
+          <w:szCs w:val="18"/>
+        </w:rPr>
+        <w:t xml:space="preserve">Figure 2. Fraud amounts skew small: a third are EUR 1.00 or less.</w:t>
+      </w:r>
+    </w:p>
+    <w:p>
+      <w:pPr>
+        <w:pStyle w:val="Heading1"/>
+        <w:spacing w:after="160" w:before="360"/>
+      </w:pPr>
+      <w:r>
+        <w:rPr>
+          <w:rFonts w:ascii="Calibri" w:cs="Calibri" w:eastAsia="Calibri" w:hAnsi="Calibri"/>
+        </w:rPr>
+        <w:t xml:space="preserve">4. Solution overview</w:t>
+      </w:r>
+    </w:p>
+    <w:p>
+      <w:pPr>
+        <w:spacing w:after="140" w:line="300"/>
+      </w:pPr>
+      <w:r>
+        <w:rPr>
+          <w:rFonts w:ascii="Calibri" w:cs="Calibri" w:eastAsia="Calibri" w:hAnsi="Calibri"/>
+        </w:rPr>
+        <w:t xml:space="preserve">FraudLens turns a day of transactions into a ranked, explained, actionable queue in six steps.</w:t>
+      </w:r>
+    </w:p>
+    <w:p>
+      <w:pPr>
+        <w:pStyle w:val="ListParagraph"/>
+        <w:numPr>
+          <w:ilvl w:val="0"/>
+          <w:numId w:val="3"/>
+        </w:numPr>
+        <w:spacing w:after="80" w:line="290"/>
+      </w:pPr>
+      <w:r>
+        <w:rPr>
+          <w:rFonts w:ascii="Calibri" w:cs="Calibri" w:eastAsia="Calibri" w:hAnsi="Calibri"/>
+          <w:b/>
+          <w:bCs/>
+        </w:rPr>
+        <w:t xml:space="preserve">Score.</w:t>
+      </w:r>
+      <w:r>
+        <w:rPr>
+          <w:rFonts w:ascii="Calibri" w:cs="Calibri" w:eastAsia="Calibri" w:hAnsi="Calibri"/>
+        </w:rPr>
+        <w:t xml:space="preserve"> A gradient-boosted model (XGBoost), trained on day 1 only, gives each transaction a fraud-risk score between 0 and 1.</w:t>
+      </w:r>
+    </w:p>
+    <w:p>
+      <w:pPr>
+        <w:pStyle w:val="ListParagraph"/>
+        <w:numPr>
+          <w:ilvl w:val="0"/>
+          <w:numId w:val="3"/>
+        </w:numPr>
+        <w:spacing w:after="80" w:line="290"/>
+      </w:pPr>
+      <w:r>
+        <w:rPr>
+          <w:rFonts w:ascii="Calibri" w:cs="Calibri" w:eastAsia="Calibri" w:hAnsi="Calibri"/>
+          <w:b/>
+          <w:bCs/>
+        </w:rPr>
+        <w:t xml:space="preserve">Rank to capacity.</w:t>
+      </w:r>
+      <w:r>
+        <w:rPr>
+          <w:rFonts w:ascii="Calibri" w:cs="Calibri" w:eastAsia="Calibri" w:hAnsi="Calibri"/>
+        </w:rPr>
+        <w:t xml:space="preserve"> The 200 highest scores become the day's alert queue. The cutoff is the team's capacity, not an arbitrary probability.</w:t>
+      </w:r>
+    </w:p>
+    <w:p>
+      <w:pPr>
+        <w:pStyle w:val="ListParagraph"/>
+        <w:numPr>
+          <w:ilvl w:val="0"/>
+          <w:numId w:val="3"/>
+        </w:numPr>
+        <w:spacing w:after="80" w:line="290"/>
+      </w:pPr>
+      <w:r>
+        <w:rPr>
+          <w:rFonts w:ascii="Calibri" w:cs="Calibri" w:eastAsia="Calibri" w:hAnsi="Calibri"/>
+          <w:b/>
+          <w:bCs/>
+        </w:rPr>
+        <w:t xml:space="preserve">Explain.</w:t>
+      </w:r>
+      <w:r>
+        <w:rPr>
+          <w:rFonts w:ascii="Calibri" w:cs="Calibri" w:eastAsia="Calibri" w:hAnsi="Calibri"/>
+        </w:rPr>
+        <w:t xml:space="preserve"> Each alert carries its top three reasons, computed as exact SHAP contributions and phrased against genuine behaviour, for example "V14 = -7.46: lower than 99.9% of genuine transactions".</w:t>
+      </w:r>
+    </w:p>
+    <w:p>
+      <w:pPr>
+        <w:pStyle w:val="ListParagraph"/>
+        <w:numPr>
+          <w:ilvl w:val="0"/>
+          <w:numId w:val="3"/>
+        </w:numPr>
+        <w:spacing w:after="80" w:line="290"/>
+      </w:pPr>
+      <w:r>
+        <w:rPr>
+          <w:rFonts w:ascii="Calibri" w:cs="Calibri" w:eastAsia="Calibri" w:hAnsi="Calibri"/>
+          <w:b/>
+          <w:bCs/>
+        </w:rPr>
+        <w:t xml:space="preserve">Recommend.</w:t>
+      </w:r>
+      <w:r>
+        <w:rPr>
+          <w:rFonts w:ascii="Calibri" w:cs="Calibri" w:eastAsia="Calibri" w:hAnsi="Calibri"/>
+        </w:rPr>
+        <w:t xml:space="preserve"> A rule-based policy maps the risk band to an action: hold and call, step-up verification, or analyst review.</w:t>
+      </w:r>
+    </w:p>
+    <w:p>
+      <w:pPr>
+        <w:pStyle w:val="ListParagraph"/>
+        <w:numPr>
+          <w:ilvl w:val="0"/>
+          <w:numId w:val="3"/>
+        </w:numPr>
+        <w:spacing w:after="80" w:line="290"/>
+      </w:pPr>
+      <w:r>
+        <w:rPr>
+          <w:rFonts w:ascii="Calibri" w:cs="Calibri" w:eastAsia="Calibri" w:hAnsi="Calibri"/>
+          <w:b/>
+          <w:bCs/>
+        </w:rPr>
+        <w:t xml:space="preserve">Draft.</w:t>
+      </w:r>
+      <w:r>
+        <w:rPr>
+          <w:rFonts w:ascii="Calibri" w:cs="Calibri" w:eastAsia="Calibri" w:hAnsi="Calibri"/>
+        </w:rPr>
+        <w:t xml:space="preserve"> A review-note agent writes the note for each alert, from a template or with a local open-source LLM whose output is checked against the evidence.</w:t>
+      </w:r>
+    </w:p>
+    <w:p>
+      <w:pPr>
+        <w:pStyle w:val="ListParagraph"/>
+        <w:numPr>
+          <w:ilvl w:val="0"/>
+          <w:numId w:val="3"/>
+        </w:numPr>
+        <w:spacing w:after="80" w:line="290"/>
+      </w:pPr>
+      <w:r>
+        <w:rPr>
+          <w:rFonts w:ascii="Calibri" w:cs="Calibri" w:eastAsia="Calibri" w:hAnsi="Calibri"/>
+          <w:b/>
+          <w:bCs/>
+        </w:rPr>
+        <w:t xml:space="preserve">Wait for a human.</w:t>
+      </w:r>
+      <w:r>
+        <w:rPr>
+          <w:rFonts w:ascii="Calibri" w:cs="Calibri" w:eastAsia="Calibri" w:hAnsi="Calibri"/>
+        </w:rPr>
+        <w:t xml:space="preserve"> Every action is PENDING_APPROVAL. An analyst approves, rejects or escalates, and each decision goes to an audit log.</w:t>
+      </w:r>
+    </w:p>
+    <w:p>
+      <w:pPr>
+        <w:keepNext/>
+        <w:spacing w:after="60" w:before="120"/>
+        <w:jc w:val="center"/>
+      </w:pPr>
+      <w:r>
+        <w:drawing>
+          <wp:inline distT="0" distB="0" distL="0" distR="0">
+            <wp:extent cx="4752975" cy="3714750"/>
+            <wp:effectExtent t="0" r="0" b="0" l="0"/>
+            <wp:docPr id="3" name="" descr="" title=""/>
+            <wp:cNvGraphicFramePr>
+              <a:graphicFrameLocks xmlns:a="http://schemas.openxmlformats.org/drawingml/2006/main" noChangeAspect="1"/>
+            </wp:cNvGraphicFramePr>
+            <a:graphic xmlns:a="http://schemas.openxmlformats.org/drawingml/2006/main">
+              <a:graphicData uri="http://schemas.openxmlformats.org/drawingml/2006/picture">
+                <pic:pic xmlns:pic="http://schemas.openxmlformats.org/drawingml/2006/picture">
+                  <pic:nvPicPr>
+                    <pic:cNvPr id="0" name="" descr=""/>
+                    <pic:cNvPicPr>
+                      <a:picLocks noChangeAspect="1" noChangeArrowheads="1"/>
+                    </pic:cNvPicPr>
+                  </pic:nvPicPr>
+                  <pic:blipFill>
+                    <a:blip r:embed="rId12" cstate="none"/>
+                    <a:srcRect/>
+                    <a:stretch>
+                      <a:fillRect/>
+                    </a:stretch>
+                  </pic:blipFill>
+                  <pic:spPr bwMode="auto">
+                    <a:xfrm>
+                      <a:off x="0" y="0"/>
                       <a:ext cx="4752975" cy="3714750"/>
                     </a:xfrm>
                     <a:prstGeom prst="rect">
@@ -1934,7 +1955,7 @@
                     </pic:cNvPicPr>
                   </pic:nvPicPr>
                   <pic:blipFill>
-                    <a:blip r:embed="rId12" cstate="none"/>
+                    <a:blip r:embed="rId13" cstate="none"/>
                     <a:srcRect/>
                     <a:stretch>
                       <a:fillRect/>
@@ -3340,7 +3361,7 @@
                     </pic:cNvPicPr>
                   </pic:nvPicPr>
                   <pic:blipFill>
-                    <a:blip r:embed="rId13" cstate="none"/>
+                    <a:blip r:embed="rId14" cstate="none"/>
                     <a:srcRect/>
                     <a:stretch>
                       <a:fillRect/>
@@ -3427,7 +3448,7 @@
                     </pic:cNvPicPr>
                   </pic:nvPicPr>
                   <pic:blipFill>
-                    <a:blip r:embed="rId14" cstate="none"/>
+                    <a:blip r:embed="rId15" cstate="none"/>
                     <a:srcRect/>
                     <a:stretch>
                       <a:fillRect/>
@@ -6000,7 +6021,7 @@
                     </pic:cNvPicPr>
                   </pic:nvPicPr>
                   <pic:blipFill>
-                    <a:blip r:embed="rId15" cstate="none"/>
+                    <a:blip r:embed="rId16" cstate="none"/>
                     <a:srcRect/>
                     <a:stretch>
                       <a:fillRect/>
@@ -6064,7 +6085,7 @@
                     </pic:cNvPicPr>
                   </pic:nvPicPr>
                   <pic:blipFill>
-                    <a:blip r:embed="rId16" cstate="none"/>
+                    <a:blip r:embed="rId17" cstate="none"/>
                     <a:srcRect/>
                     <a:stretch>
                       <a:fillRect/>
@@ -7349,7 +7370,7 @@
                     </pic:cNvPicPr>
                   </pic:nvPicPr>
                   <pic:blipFill>
-                    <a:blip r:embed="rId17" cstate="none"/>
+                    <a:blip r:embed="rId18" cstate="none"/>
                     <a:srcRect/>
                     <a:stretch>
                       <a:fillRect/>

</xml_diff>